<commit_message>
add Vercel Analytics for Vite, clean up unused assets
</commit_message>
<xml_diff>
--- a/public/Ashish_Kumar_Resume.docx
+++ b/public/Ashish_Kumar_Resume.docx
@@ -27,9 +27,38 @@
         <w:rPr>
           <w:rFonts w:ascii="Calibri" w:eastAsia="Calibri" w:hAnsi="Calibri" w:cs="Calibri"/>
         </w:rPr>
-        <w:t xml:space="preserve">+91 8852906820 | ashishkumar62649@gmail.com | Bangalore, India | Portfolio (coming soon) | </w:t>
+        <w:t xml:space="preserve">+91 8852906820 | ashishkumar62649@gmail.com | Bangalore, India | </w:t>
       </w:r>
       <w:hyperlink r:id="rId5" w:history="1">
+        <w:r>
+          <w:rPr>
+            <w:rStyle w:val="Hyperlink"/>
+            <w:rFonts w:ascii="Calibri" w:eastAsia="Calibri" w:hAnsi="Calibri" w:cs="Calibri"/>
+          </w:rPr>
+          <w:t>Portf</w:t>
+        </w:r>
+        <w:r>
+          <w:rPr>
+            <w:rStyle w:val="Hyperlink"/>
+            <w:rFonts w:ascii="Calibri" w:eastAsia="Calibri" w:hAnsi="Calibri" w:cs="Calibri"/>
+          </w:rPr>
+          <w:t>o</w:t>
+        </w:r>
+        <w:r>
+          <w:rPr>
+            <w:rStyle w:val="Hyperlink"/>
+            <w:rFonts w:ascii="Calibri" w:eastAsia="Calibri" w:hAnsi="Calibri" w:cs="Calibri"/>
+          </w:rPr>
+          <w:t>lio</w:t>
+        </w:r>
+      </w:hyperlink>
+      <w:r>
+        <w:rPr>
+          <w:rFonts w:ascii="Calibri" w:eastAsia="Calibri" w:hAnsi="Calibri" w:cs="Calibri"/>
+        </w:rPr>
+        <w:t xml:space="preserve"> | </w:t>
+      </w:r>
+      <w:hyperlink r:id="rId6" w:history="1">
         <w:r>
           <w:rPr>
             <w:rStyle w:val="Hyperlink"/>
@@ -43,284 +72,6 @@
           <w:rFonts w:ascii="Calibri" w:eastAsia="Calibri" w:hAnsi="Calibri" w:cs="Calibri"/>
         </w:rPr>
         <w:t xml:space="preserve"> | </w:t>
-      </w:r>
-      <w:hyperlink r:id="rId6" w:history="1">
-        <w:r>
-          <w:rPr>
-            <w:rStyle w:val="Hyperlink"/>
-            <w:rFonts w:ascii="Calibri" w:eastAsia="Calibri" w:hAnsi="Calibri" w:cs="Calibri"/>
-          </w:rPr>
-          <w:t>GitHub</w:t>
-        </w:r>
-      </w:hyperlink>
-    </w:p>
-    <w:p>
-      <w:pPr>
-        <w:pBdr>
-          <w:bottom w:val="single" w:sz="6" w:space="2" w:color="000000"/>
-        </w:pBdr>
-        <w:spacing w:before="140" w:after="40"/>
-      </w:pPr>
-      <w:r>
-        <w:rPr>
-          <w:rFonts w:ascii="Calibri" w:eastAsia="Calibri" w:hAnsi="Calibri" w:cs="Calibri"/>
-          <w:b/>
-          <w:bCs/>
-          <w:sz w:val="19"/>
-          <w:szCs w:val="19"/>
-        </w:rPr>
-        <w:t>SUMMARY</w:t>
-      </w:r>
-    </w:p>
-    <w:p>
-      <w:pPr>
-        <w:spacing w:after="60"/>
-      </w:pPr>
-      <w:r>
-        <w:rPr>
-          <w:rFonts w:ascii="Calibri" w:eastAsia="Calibri" w:hAnsi="Calibri" w:cs="Calibri"/>
-        </w:rPr>
-        <w:t>AI and Data Science undergraduate at IIT Guwahati with hands-on data science internship experience and a strong interest in machine learning, agentic AI systems, and Python/API-based problem solving. Comfortable building end-to-end pipelines, from data processing to RAG and agent-based applications.</w:t>
-      </w:r>
-    </w:p>
-    <w:p>
-      <w:pPr>
-        <w:pBdr>
-          <w:bottom w:val="single" w:sz="6" w:space="2" w:color="000000"/>
-        </w:pBdr>
-        <w:spacing w:before="140" w:after="40"/>
-      </w:pPr>
-      <w:r>
-        <w:rPr>
-          <w:rFonts w:ascii="Calibri" w:eastAsia="Calibri" w:hAnsi="Calibri" w:cs="Calibri"/>
-          <w:b/>
-          <w:bCs/>
-          <w:sz w:val="19"/>
-          <w:szCs w:val="19"/>
-        </w:rPr>
-        <w:t>EDUCATION</w:t>
-      </w:r>
-    </w:p>
-    <w:p>
-      <w:pPr>
-        <w:tabs>
-          <w:tab w:val="right" w:pos="9026"/>
-        </w:tabs>
-        <w:spacing w:before="100"/>
-      </w:pPr>
-      <w:r>
-        <w:rPr>
-          <w:rFonts w:ascii="Calibri" w:eastAsia="Calibri" w:hAnsi="Calibri" w:cs="Calibri"/>
-          <w:b/>
-          <w:bCs/>
-        </w:rPr>
-        <w:t>Indian Institute of Technology Guwahati</w:t>
-      </w:r>
-      <w:r>
-        <w:rPr>
-          <w:rFonts w:ascii="Calibri" w:eastAsia="Calibri" w:hAnsi="Calibri" w:cs="Calibri"/>
-        </w:rPr>
-        <w:tab/>
-        <w:t>Expected 2029</w:t>
-      </w:r>
-    </w:p>
-    <w:p>
-      <w:pPr>
-        <w:tabs>
-          <w:tab w:val="right" w:pos="9026"/>
-        </w:tabs>
-        <w:spacing w:after="40"/>
-      </w:pPr>
-      <w:r>
-        <w:rPr>
-          <w:rFonts w:ascii="Calibri" w:eastAsia="Calibri" w:hAnsi="Calibri" w:cs="Calibri"/>
-          <w:i/>
-          <w:iCs/>
-        </w:rPr>
-        <w:t>BSc (Honors) in Data Science and Artificial Intelligence</w:t>
-      </w:r>
-      <w:r>
-        <w:rPr>
-          <w:rFonts w:ascii="Calibri" w:eastAsia="Calibri" w:hAnsi="Calibri" w:cs="Calibri"/>
-          <w:i/>
-          <w:iCs/>
-        </w:rPr>
-        <w:tab/>
-      </w:r>
-    </w:p>
-    <w:p>
-      <w:pPr>
-        <w:spacing w:after="40"/>
-        <w:ind w:left="270" w:hanging="200"/>
-      </w:pPr>
-      <w:r>
-        <w:rPr>
-          <w:rFonts w:ascii="Calibri" w:eastAsia="Calibri" w:hAnsi="Calibri" w:cs="Calibri"/>
-        </w:rPr>
-        <w:t>– Relevant Coursework: Python Programming, Data Science, Artificial Intelligence, Statistics, Probability, Databases, Machine Learning</w:t>
-      </w:r>
-    </w:p>
-    <w:p>
-      <w:pPr>
-        <w:pBdr>
-          <w:bottom w:val="single" w:sz="6" w:space="2" w:color="000000"/>
-        </w:pBdr>
-        <w:spacing w:before="140" w:after="40"/>
-      </w:pPr>
-      <w:r>
-        <w:rPr>
-          <w:rFonts w:ascii="Calibri" w:eastAsia="Calibri" w:hAnsi="Calibri" w:cs="Calibri"/>
-          <w:b/>
-          <w:bCs/>
-          <w:sz w:val="19"/>
-          <w:szCs w:val="19"/>
-        </w:rPr>
-        <w:t>EXPERIENCE</w:t>
-      </w:r>
-    </w:p>
-    <w:p>
-      <w:pPr>
-        <w:tabs>
-          <w:tab w:val="right" w:pos="9026"/>
-        </w:tabs>
-        <w:spacing w:before="100"/>
-      </w:pPr>
-      <w:r>
-        <w:rPr>
-          <w:rFonts w:ascii="Calibri" w:eastAsia="Calibri" w:hAnsi="Calibri" w:cs="Calibri"/>
-          <w:b/>
-          <w:bCs/>
-        </w:rPr>
-        <w:t>Data Scientist Intern</w:t>
-      </w:r>
-      <w:r>
-        <w:rPr>
-          <w:rFonts w:ascii="Calibri" w:eastAsia="Calibri" w:hAnsi="Calibri" w:cs="Calibri"/>
-        </w:rPr>
-        <w:tab/>
-        <w:t>Dec 2025 – Jan 2026</w:t>
-      </w:r>
-    </w:p>
-    <w:p>
-      <w:pPr>
-        <w:tabs>
-          <w:tab w:val="right" w:pos="9026"/>
-        </w:tabs>
-        <w:spacing w:after="40"/>
-      </w:pPr>
-      <w:r>
-        <w:rPr>
-          <w:rFonts w:ascii="Calibri" w:eastAsia="Calibri" w:hAnsi="Calibri" w:cs="Calibri"/>
-          <w:i/>
-          <w:iCs/>
-        </w:rPr>
-        <w:t>Evoastra</w:t>
-      </w:r>
-      <w:r>
-        <w:rPr>
-          <w:rFonts w:ascii="Calibri" w:eastAsia="Calibri" w:hAnsi="Calibri" w:cs="Calibri"/>
-          <w:i/>
-          <w:iCs/>
-        </w:rPr>
-        <w:tab/>
-        <w:t>Remote</w:t>
-      </w:r>
-    </w:p>
-    <w:p>
-      <w:pPr>
-        <w:spacing w:after="40"/>
-        <w:ind w:left="270" w:hanging="200"/>
-      </w:pPr>
-      <w:r>
-        <w:rPr>
-          <w:rFonts w:ascii="Calibri" w:eastAsia="Calibri" w:hAnsi="Calibri" w:cs="Calibri"/>
-        </w:rPr>
-        <w:t>– Built an unsupervised anomaly detection pipeline to identify unusual building energy consumption patterns from meter data.</w:t>
-      </w:r>
-    </w:p>
-    <w:p>
-      <w:pPr>
-        <w:spacing w:after="40"/>
-        <w:ind w:left="270" w:hanging="200"/>
-      </w:pPr>
-      <w:r>
-        <w:rPr>
-          <w:rFonts w:ascii="Calibri" w:eastAsia="Calibri" w:hAnsi="Calibri" w:cs="Calibri"/>
-        </w:rPr>
-        <w:t>– Cleaned and transformed data, handled missing values, engineered features, and prepared reproducible model-training notebooks.</w:t>
-      </w:r>
-    </w:p>
-    <w:p>
-      <w:pPr>
-        <w:spacing w:after="40"/>
-        <w:ind w:left="270" w:hanging="200"/>
-      </w:pPr>
-      <w:r>
-        <w:rPr>
-          <w:rFonts w:ascii="Calibri" w:eastAsia="Calibri" w:hAnsi="Calibri" w:cs="Calibri"/>
-        </w:rPr>
-        <w:t>– Trained and compared Isolation Forest and Local Outlier Factor baselines; documented code, results, and project workflow on GitHub.</w:t>
-      </w:r>
-    </w:p>
-    <w:p>
-      <w:pPr>
-        <w:pBdr>
-          <w:bottom w:val="single" w:sz="6" w:space="2" w:color="000000"/>
-        </w:pBdr>
-        <w:spacing w:before="140" w:after="40"/>
-      </w:pPr>
-      <w:r>
-        <w:rPr>
-          <w:rFonts w:ascii="Calibri" w:eastAsia="Calibri" w:hAnsi="Calibri" w:cs="Calibri"/>
-          <w:b/>
-          <w:bCs/>
-          <w:sz w:val="19"/>
-          <w:szCs w:val="19"/>
-        </w:rPr>
-        <w:t>PROJECTS</w:t>
-      </w:r>
-    </w:p>
-    <w:p>
-      <w:pPr>
-        <w:spacing w:before="120" w:after="20"/>
-      </w:pPr>
-      <w:r>
-        <w:rPr>
-          <w:rFonts w:ascii="Calibri" w:eastAsia="Calibri" w:hAnsi="Calibri" w:cs="Calibri"/>
-          <w:b/>
-          <w:bCs/>
-        </w:rPr>
-        <w:t xml:space="preserve">god-eyes </w:t>
-      </w:r>
-      <w:r>
-        <w:rPr>
-          <w:rFonts w:ascii="Calibri" w:eastAsia="Calibri" w:hAnsi="Calibri" w:cs="Calibri"/>
-          <w:i/>
-          <w:iCs/>
-        </w:rPr>
-        <w:t xml:space="preserve">| TypeScript, Python, React, CesiumJS, Fastify, </w:t>
-      </w:r>
-      <w:proofErr w:type="gramStart"/>
-      <w:r>
-        <w:rPr>
-          <w:rFonts w:ascii="Calibri" w:eastAsia="Calibri" w:hAnsi="Calibri" w:cs="Calibri"/>
-          <w:i/>
-          <w:iCs/>
-        </w:rPr>
-        <w:t>PostGIS</w:t>
-      </w:r>
-      <w:r>
-        <w:rPr>
-          <w:rFonts w:ascii="Calibri" w:eastAsia="Calibri" w:hAnsi="Calibri" w:cs="Calibri"/>
-        </w:rPr>
-        <w:t xml:space="preserve">  |</w:t>
-      </w:r>
-      <w:proofErr w:type="gramEnd"/>
-      <w:r>
-        <w:rPr>
-          <w:rFonts w:ascii="Calibri" w:eastAsia="Calibri" w:hAnsi="Calibri" w:cs="Calibri"/>
-        </w:rPr>
-        <w:t xml:space="preserve">  </w:t>
       </w:r>
       <w:hyperlink r:id="rId7" w:history="1">
         <w:r>
@@ -334,6 +85,100 @@
     </w:p>
     <w:p>
       <w:pPr>
+        <w:pBdr>
+          <w:bottom w:val="single" w:sz="6" w:space="2" w:color="000000"/>
+        </w:pBdr>
+        <w:spacing w:before="140" w:after="40"/>
+      </w:pPr>
+      <w:r>
+        <w:rPr>
+          <w:rFonts w:ascii="Calibri" w:eastAsia="Calibri" w:hAnsi="Calibri" w:cs="Calibri"/>
+          <w:b/>
+          <w:bCs/>
+          <w:sz w:val="19"/>
+          <w:szCs w:val="19"/>
+        </w:rPr>
+        <w:t>SUMMARY</w:t>
+      </w:r>
+    </w:p>
+    <w:p>
+      <w:pPr>
+        <w:spacing w:after="60"/>
+      </w:pPr>
+      <w:r>
+        <w:rPr>
+          <w:rFonts w:ascii="Calibri" w:eastAsia="Calibri" w:hAnsi="Calibri" w:cs="Calibri"/>
+        </w:rPr>
+        <w:t>AI and Data Science undergraduate at IIT Guwahati with hands-on data science internship experience and a strong interest in machine learning, agentic AI systems, and Python/API-based problem solving. Comfortable building end-to-end pipelines, from data processing to RAG and agent-based applications.</w:t>
+      </w:r>
+    </w:p>
+    <w:p>
+      <w:pPr>
+        <w:pBdr>
+          <w:bottom w:val="single" w:sz="6" w:space="2" w:color="000000"/>
+        </w:pBdr>
+        <w:spacing w:before="140" w:after="40"/>
+      </w:pPr>
+      <w:r>
+        <w:rPr>
+          <w:rFonts w:ascii="Calibri" w:eastAsia="Calibri" w:hAnsi="Calibri" w:cs="Calibri"/>
+          <w:b/>
+          <w:bCs/>
+          <w:sz w:val="19"/>
+          <w:szCs w:val="19"/>
+        </w:rPr>
+        <w:t>EDUCATION</w:t>
+      </w:r>
+    </w:p>
+    <w:p>
+      <w:pPr>
+        <w:tabs>
+          <w:tab w:val="right" w:pos="9026"/>
+        </w:tabs>
+        <w:spacing w:before="100"/>
+      </w:pPr>
+      <w:r>
+        <w:rPr>
+          <w:rFonts w:ascii="Calibri" w:eastAsia="Calibri" w:hAnsi="Calibri" w:cs="Calibri"/>
+          <w:b/>
+          <w:bCs/>
+        </w:rPr>
+        <w:t>Indian Institute of Technology Guwahati</w:t>
+      </w:r>
+      <w:r>
+        <w:rPr>
+          <w:rFonts w:ascii="Calibri" w:eastAsia="Calibri" w:hAnsi="Calibri" w:cs="Calibri"/>
+        </w:rPr>
+        <w:tab/>
+        <w:t>Expected 2029</w:t>
+      </w:r>
+    </w:p>
+    <w:p>
+      <w:pPr>
+        <w:tabs>
+          <w:tab w:val="right" w:pos="9026"/>
+        </w:tabs>
+        <w:spacing w:after="40"/>
+      </w:pPr>
+      <w:r>
+        <w:rPr>
+          <w:rFonts w:ascii="Calibri" w:eastAsia="Calibri" w:hAnsi="Calibri" w:cs="Calibri"/>
+          <w:i/>
+          <w:iCs/>
+        </w:rPr>
+        <w:t>BSc (Honors) in Data Science and Artificial Intelligence</w:t>
+      </w:r>
+      <w:r>
+        <w:rPr>
+          <w:rFonts w:ascii="Calibri" w:eastAsia="Calibri" w:hAnsi="Calibri" w:cs="Calibri"/>
+          <w:i/>
+          <w:iCs/>
+        </w:rPr>
+        <w:tab/>
+      </w:r>
+    </w:p>
+    <w:p>
+      <w:pPr>
         <w:spacing w:after="40"/>
         <w:ind w:left="270" w:hanging="200"/>
       </w:pPr>
@@ -341,7 +186,75 @@
         <w:rPr>
           <w:rFonts w:ascii="Calibri" w:eastAsia="Calibri" w:hAnsi="Calibri" w:cs="Calibri"/>
         </w:rPr>
-        <w:t>– Built a full-stack geospatial intelligence prototype with 8 live data layers, including aviation, maritime, satellites, weather, earthquakes, borders, energy, and news, on a CesiumJS 3D globe.</w:t>
+        <w:t>– Relevant Coursework: Python Programming, Data Science, Artificial Intelligence, Statistics, Probability, Databases, Machine Learning</w:t>
+      </w:r>
+    </w:p>
+    <w:p>
+      <w:pPr>
+        <w:pBdr>
+          <w:bottom w:val="single" w:sz="6" w:space="2" w:color="000000"/>
+        </w:pBdr>
+        <w:spacing w:before="140" w:after="40"/>
+      </w:pPr>
+      <w:r>
+        <w:rPr>
+          <w:rFonts w:ascii="Calibri" w:eastAsia="Calibri" w:hAnsi="Calibri" w:cs="Calibri"/>
+          <w:b/>
+          <w:bCs/>
+          <w:sz w:val="19"/>
+          <w:szCs w:val="19"/>
+        </w:rPr>
+        <w:t>EXPERIENCE</w:t>
+      </w:r>
+    </w:p>
+    <w:p>
+      <w:pPr>
+        <w:tabs>
+          <w:tab w:val="right" w:pos="9026"/>
+        </w:tabs>
+        <w:spacing w:before="100"/>
+      </w:pPr>
+      <w:r>
+        <w:rPr>
+          <w:rFonts w:ascii="Calibri" w:eastAsia="Calibri" w:hAnsi="Calibri" w:cs="Calibri"/>
+          <w:b/>
+          <w:bCs/>
+        </w:rPr>
+        <w:t>Data Scientist Intern</w:t>
+      </w:r>
+      <w:r>
+        <w:rPr>
+          <w:rFonts w:ascii="Calibri" w:eastAsia="Calibri" w:hAnsi="Calibri" w:cs="Calibri"/>
+        </w:rPr>
+        <w:tab/>
+        <w:t>Dec 2025 – Jan 2026</w:t>
+      </w:r>
+    </w:p>
+    <w:p>
+      <w:pPr>
+        <w:tabs>
+          <w:tab w:val="right" w:pos="9026"/>
+        </w:tabs>
+        <w:spacing w:after="40"/>
+      </w:pPr>
+      <w:proofErr w:type="spellStart"/>
+      <w:r>
+        <w:rPr>
+          <w:rFonts w:ascii="Calibri" w:eastAsia="Calibri" w:hAnsi="Calibri" w:cs="Calibri"/>
+          <w:i/>
+          <w:iCs/>
+        </w:rPr>
+        <w:t>Evoastra</w:t>
+      </w:r>
+      <w:proofErr w:type="spellEnd"/>
+      <w:r>
+        <w:rPr>
+          <w:rFonts w:ascii="Calibri" w:eastAsia="Calibri" w:hAnsi="Calibri" w:cs="Calibri"/>
+          <w:i/>
+          <w:iCs/>
+        </w:rPr>
+        <w:tab/>
+        <w:t>Remote</w:t>
       </w:r>
     </w:p>
     <w:p>
@@ -353,7 +266,7 @@
         <w:rPr>
           <w:rFonts w:ascii="Calibri" w:eastAsia="Calibri" w:hAnsi="Calibri" w:cs="Calibri"/>
         </w:rPr>
-        <w:t>– Integrated 10+ external data sources using Python fetch/normalize pipelines, Fastify REST APIs, and WebSocket broadcasters with client-side filtering.</w:t>
+        <w:t>– Built an unsupervised anomaly detection pipeline to identify unusual building energy consumption patterns from meter data.</w:t>
       </w:r>
     </w:p>
     <w:p>
@@ -365,29 +278,96 @@
         <w:rPr>
           <w:rFonts w:ascii="Calibri" w:eastAsia="Calibri" w:hAnsi="Calibri" w:cs="Calibri"/>
         </w:rPr>
-        <w:t>– Designed a PostgreSQL/PostGIS schema with 40+ tables, shared Zod contracts, CI, and Vitest coverage for an active 678-commit prototype.</w:t>
-      </w:r>
-    </w:p>
-    <w:p>
-      <w:pPr>
-        <w:spacing w:before="120" w:after="20"/>
+        <w:t>– Cleaned and transformed data, handled missing values, engineered features, and prepared reproducible model-training notebooks.</w:t>
+      </w:r>
+    </w:p>
+    <w:p>
+      <w:pPr>
+        <w:spacing w:after="40"/>
+        <w:ind w:left="270" w:hanging="200"/>
+      </w:pPr>
+      <w:r>
+        <w:rPr>
+          <w:rFonts w:ascii="Calibri" w:eastAsia="Calibri" w:hAnsi="Calibri" w:cs="Calibri"/>
+        </w:rPr>
+        <w:t>– Trained and compared Isolation Forest and Local Outlier Factor baselines; documented code, results, and project workflow on GitHub.</w:t>
+      </w:r>
+    </w:p>
+    <w:p>
+      <w:pPr>
+        <w:pBdr>
+          <w:bottom w:val="single" w:sz="6" w:space="2" w:color="000000"/>
+        </w:pBdr>
+        <w:spacing w:before="140" w:after="40"/>
       </w:pPr>
       <w:r>
         <w:rPr>
           <w:rFonts w:ascii="Calibri" w:eastAsia="Calibri" w:hAnsi="Calibri" w:cs="Calibri"/>
           <w:b/>
           <w:bCs/>
-        </w:rPr>
-        <w:t xml:space="preserve">AI-Codebase-Onboarding-Agent </w:t>
-      </w:r>
-      <w:r>
-        <w:rPr>
-          <w:rFonts w:ascii="Calibri" w:eastAsia="Calibri" w:hAnsi="Calibri" w:cs="Calibri"/>
-          <w:i/>
-          <w:iCs/>
-        </w:rPr>
-        <w:t xml:space="preserve">| Python, LangGraph, FastAPI, Streamlit, </w:t>
-      </w:r>
+          <w:sz w:val="19"/>
+          <w:szCs w:val="19"/>
+        </w:rPr>
+        <w:t>PROJECTS</w:t>
+      </w:r>
+    </w:p>
+    <w:p>
+      <w:pPr>
+        <w:spacing w:before="120" w:after="20"/>
+      </w:pPr>
+      <w:r>
+        <w:rPr>
+          <w:rFonts w:ascii="Calibri" w:eastAsia="Calibri" w:hAnsi="Calibri" w:cs="Calibri"/>
+          <w:b/>
+          <w:bCs/>
+        </w:rPr>
+        <w:t xml:space="preserve">god-eyes </w:t>
+      </w:r>
+      <w:r>
+        <w:rPr>
+          <w:rFonts w:ascii="Calibri" w:eastAsia="Calibri" w:hAnsi="Calibri" w:cs="Calibri"/>
+          <w:i/>
+          <w:iCs/>
+        </w:rPr>
+        <w:t xml:space="preserve">| TypeScript, Python, React, </w:t>
+      </w:r>
+      <w:proofErr w:type="spellStart"/>
+      <w:r>
+        <w:rPr>
+          <w:rFonts w:ascii="Calibri" w:eastAsia="Calibri" w:hAnsi="Calibri" w:cs="Calibri"/>
+          <w:i/>
+          <w:iCs/>
+        </w:rPr>
+        <w:t>CesiumJS</w:t>
+      </w:r>
+      <w:proofErr w:type="spellEnd"/>
+      <w:r>
+        <w:rPr>
+          <w:rFonts w:ascii="Calibri" w:eastAsia="Calibri" w:hAnsi="Calibri" w:cs="Calibri"/>
+          <w:i/>
+          <w:iCs/>
+        </w:rPr>
+        <w:t xml:space="preserve">, </w:t>
+      </w:r>
+      <w:proofErr w:type="spellStart"/>
+      <w:r>
+        <w:rPr>
+          <w:rFonts w:ascii="Calibri" w:eastAsia="Calibri" w:hAnsi="Calibri" w:cs="Calibri"/>
+          <w:i/>
+          <w:iCs/>
+        </w:rPr>
+        <w:t>Fastify</w:t>
+      </w:r>
+      <w:proofErr w:type="spellEnd"/>
+      <w:r>
+        <w:rPr>
+          <w:rFonts w:ascii="Calibri" w:eastAsia="Calibri" w:hAnsi="Calibri" w:cs="Calibri"/>
+          <w:i/>
+          <w:iCs/>
+        </w:rPr>
+        <w:t xml:space="preserve">, </w:t>
+      </w:r>
+      <w:proofErr w:type="spellStart"/>
       <w:proofErr w:type="gramStart"/>
       <w:r>
         <w:rPr>
@@ -395,8 +375,9 @@
           <w:i/>
           <w:iCs/>
         </w:rPr>
-        <w:t>pgvector</w:t>
-      </w:r>
+        <w:t>PostGIS</w:t>
+      </w:r>
+      <w:proofErr w:type="spellEnd"/>
       <w:r>
         <w:rPr>
           <w:rFonts w:ascii="Calibri" w:eastAsia="Calibri" w:hAnsi="Calibri" w:cs="Calibri"/>
@@ -429,7 +410,87 @@
         <w:rPr>
           <w:rFonts w:ascii="Calibri" w:eastAsia="Calibri" w:hAnsi="Calibri" w:cs="Calibri"/>
         </w:rPr>
-        <w:t>– Building a code-aware RAG assistant that indexes repositories, extracts symbols/routes, chunks functions, and answers architecture, debugging, and impact-analysis questions with file-level evidence.</w:t>
+        <w:t xml:space="preserve">– Built a full-stack geospatial intelligence prototype with 8 live data layers, including aviation, maritime, satellites, weather, earthquakes, borders, energy, and news, on a </w:t>
+      </w:r>
+      <w:proofErr w:type="spellStart"/>
+      <w:r>
+        <w:rPr>
+          <w:rFonts w:ascii="Calibri" w:eastAsia="Calibri" w:hAnsi="Calibri" w:cs="Calibri"/>
+        </w:rPr>
+        <w:t>CesiumJS</w:t>
+      </w:r>
+      <w:proofErr w:type="spellEnd"/>
+      <w:r>
+        <w:rPr>
+          <w:rFonts w:ascii="Calibri" w:eastAsia="Calibri" w:hAnsi="Calibri" w:cs="Calibri"/>
+        </w:rPr>
+        <w:t xml:space="preserve"> 3D globe.</w:t>
+      </w:r>
+    </w:p>
+    <w:p>
+      <w:pPr>
+        <w:spacing w:after="40"/>
+        <w:ind w:left="270" w:hanging="200"/>
+      </w:pPr>
+      <w:r>
+        <w:rPr>
+          <w:rFonts w:ascii="Calibri" w:eastAsia="Calibri" w:hAnsi="Calibri" w:cs="Calibri"/>
+        </w:rPr>
+        <w:t xml:space="preserve">– Integrated 10+ external data sources using Python fetch/normalize pipelines, </w:t>
+      </w:r>
+      <w:proofErr w:type="spellStart"/>
+      <w:r>
+        <w:rPr>
+          <w:rFonts w:ascii="Calibri" w:eastAsia="Calibri" w:hAnsi="Calibri" w:cs="Calibri"/>
+        </w:rPr>
+        <w:t>Fastify</w:t>
+      </w:r>
+      <w:proofErr w:type="spellEnd"/>
+      <w:r>
+        <w:rPr>
+          <w:rFonts w:ascii="Calibri" w:eastAsia="Calibri" w:hAnsi="Calibri" w:cs="Calibri"/>
+        </w:rPr>
+        <w:t xml:space="preserve"> REST APIs, and WebSocket broadcasters with client-side filtering.</w:t>
+      </w:r>
+    </w:p>
+    <w:p>
+      <w:pPr>
+        <w:spacing w:after="40"/>
+        <w:ind w:left="270" w:hanging="200"/>
+      </w:pPr>
+      <w:r>
+        <w:rPr>
+          <w:rFonts w:ascii="Calibri" w:eastAsia="Calibri" w:hAnsi="Calibri" w:cs="Calibri"/>
+        </w:rPr>
+        <w:t>– Designed a PostgreSQL/</w:t>
+      </w:r>
+      <w:proofErr w:type="spellStart"/>
+      <w:r>
+        <w:rPr>
+          <w:rFonts w:ascii="Calibri" w:eastAsia="Calibri" w:hAnsi="Calibri" w:cs="Calibri"/>
+        </w:rPr>
+        <w:t>PostGIS</w:t>
+      </w:r>
+      <w:proofErr w:type="spellEnd"/>
+      <w:r>
+        <w:rPr>
+          <w:rFonts w:ascii="Calibri" w:eastAsia="Calibri" w:hAnsi="Calibri" w:cs="Calibri"/>
+        </w:rPr>
+        <w:t xml:space="preserve"> schema with 40+ tables, shared Zod contracts, CI, and </w:t>
+      </w:r>
+      <w:proofErr w:type="spellStart"/>
+      <w:r>
+        <w:rPr>
+          <w:rFonts w:ascii="Calibri" w:eastAsia="Calibri" w:hAnsi="Calibri" w:cs="Calibri"/>
+        </w:rPr>
+        <w:t>Vitest</w:t>
+      </w:r>
+      <w:proofErr w:type="spellEnd"/>
+      <w:r>
+        <w:rPr>
+          <w:rFonts w:ascii="Calibri" w:eastAsia="Calibri" w:hAnsi="Calibri" w:cs="Calibri"/>
+        </w:rPr>
+        <w:t xml:space="preserve"> coverage for an active 678-commit prototype.</w:t>
       </w:r>
     </w:p>
     <w:p>
@@ -442,16 +503,71 @@
           <w:b/>
           <w:bCs/>
         </w:rPr>
-        <w:t xml:space="preserve">AI-Research-Paper-to-Prototype-Agent </w:t>
-      </w:r>
-      <w:r>
-        <w:rPr>
-          <w:rFonts w:ascii="Calibri" w:eastAsia="Calibri" w:hAnsi="Calibri" w:cs="Calibri"/>
-          <w:i/>
-          <w:iCs/>
-        </w:rPr>
-        <w:t xml:space="preserve">| Python, LangGraph, FastAPI, Streamlit, </w:t>
-      </w:r>
+        <w:t xml:space="preserve">AI-Codebase-Onboarding-Agent </w:t>
+      </w:r>
+      <w:r>
+        <w:rPr>
+          <w:rFonts w:ascii="Calibri" w:eastAsia="Calibri" w:hAnsi="Calibri" w:cs="Calibri"/>
+          <w:i/>
+          <w:iCs/>
+        </w:rPr>
+        <w:t xml:space="preserve">| Python, </w:t>
+      </w:r>
+      <w:proofErr w:type="spellStart"/>
+      <w:r>
+        <w:rPr>
+          <w:rFonts w:ascii="Calibri" w:eastAsia="Calibri" w:hAnsi="Calibri" w:cs="Calibri"/>
+          <w:i/>
+          <w:iCs/>
+        </w:rPr>
+        <w:t>LangGraph</w:t>
+      </w:r>
+      <w:proofErr w:type="spellEnd"/>
+      <w:r>
+        <w:rPr>
+          <w:rFonts w:ascii="Calibri" w:eastAsia="Calibri" w:hAnsi="Calibri" w:cs="Calibri"/>
+          <w:i/>
+          <w:iCs/>
+        </w:rPr>
+        <w:t xml:space="preserve">, </w:t>
+      </w:r>
+      <w:proofErr w:type="spellStart"/>
+      <w:r>
+        <w:rPr>
+          <w:rFonts w:ascii="Calibri" w:eastAsia="Calibri" w:hAnsi="Calibri" w:cs="Calibri"/>
+          <w:i/>
+          <w:iCs/>
+        </w:rPr>
+        <w:t>FastAPI</w:t>
+      </w:r>
+      <w:proofErr w:type="spellEnd"/>
+      <w:r>
+        <w:rPr>
+          <w:rFonts w:ascii="Calibri" w:eastAsia="Calibri" w:hAnsi="Calibri" w:cs="Calibri"/>
+          <w:i/>
+          <w:iCs/>
+        </w:rPr>
+        <w:t xml:space="preserve">, </w:t>
+      </w:r>
+      <w:proofErr w:type="spellStart"/>
+      <w:r>
+        <w:rPr>
+          <w:rFonts w:ascii="Calibri" w:eastAsia="Calibri" w:hAnsi="Calibri" w:cs="Calibri"/>
+          <w:i/>
+          <w:iCs/>
+        </w:rPr>
+        <w:t>Streamlit</w:t>
+      </w:r>
+      <w:proofErr w:type="spellEnd"/>
+      <w:r>
+        <w:rPr>
+          <w:rFonts w:ascii="Calibri" w:eastAsia="Calibri" w:hAnsi="Calibri" w:cs="Calibri"/>
+          <w:i/>
+          <w:iCs/>
+        </w:rPr>
+        <w:t xml:space="preserve">, </w:t>
+      </w:r>
+      <w:proofErr w:type="spellStart"/>
       <w:proofErr w:type="gramStart"/>
       <w:r>
         <w:rPr>
@@ -459,8 +575,9 @@
           <w:i/>
           <w:iCs/>
         </w:rPr>
-        <w:t>PyMuPDF</w:t>
-      </w:r>
+        <w:t>pgvector</w:t>
+      </w:r>
+      <w:proofErr w:type="spellEnd"/>
       <w:r>
         <w:rPr>
           <w:rFonts w:ascii="Calibri" w:eastAsia="Calibri" w:hAnsi="Calibri" w:cs="Calibri"/>
@@ -493,7 +610,7 @@
         <w:rPr>
           <w:rFonts w:ascii="Calibri" w:eastAsia="Calibri" w:hAnsi="Calibri" w:cs="Calibri"/>
         </w:rPr>
-        <w:t>– Designing an agentic RAG workflow that parses AI/ML papers into method breakdowns, implementation roadmaps, starter code structure, experiment configs, and reproducibility reports.</w:t>
+        <w:t>– Building a code-aware RAG assistant that indexes repositories, extracts symbols/routes, chunks functions, and answers architecture, debugging, and impact-analysis questions with file-level evidence.</w:t>
       </w:r>
     </w:p>
     <w:p>
@@ -506,16 +623,71 @@
           <w:b/>
           <w:bCs/>
         </w:rPr>
-        <w:t xml:space="preserve">AI-RFP-Proposal-Generative-Agent </w:t>
-      </w:r>
-      <w:r>
-        <w:rPr>
-          <w:rFonts w:ascii="Calibri" w:eastAsia="Calibri" w:hAnsi="Calibri" w:cs="Calibri"/>
-          <w:i/>
-          <w:iCs/>
-        </w:rPr>
-        <w:t xml:space="preserve">| Python, LangGraph, FastAPI, Streamlit, pgvector, </w:t>
-      </w:r>
+        <w:t xml:space="preserve">AI-Research-Paper-to-Prototype-Agent </w:t>
+      </w:r>
+      <w:r>
+        <w:rPr>
+          <w:rFonts w:ascii="Calibri" w:eastAsia="Calibri" w:hAnsi="Calibri" w:cs="Calibri"/>
+          <w:i/>
+          <w:iCs/>
+        </w:rPr>
+        <w:t xml:space="preserve">| Python, </w:t>
+      </w:r>
+      <w:proofErr w:type="spellStart"/>
+      <w:r>
+        <w:rPr>
+          <w:rFonts w:ascii="Calibri" w:eastAsia="Calibri" w:hAnsi="Calibri" w:cs="Calibri"/>
+          <w:i/>
+          <w:iCs/>
+        </w:rPr>
+        <w:t>LangGraph</w:t>
+      </w:r>
+      <w:proofErr w:type="spellEnd"/>
+      <w:r>
+        <w:rPr>
+          <w:rFonts w:ascii="Calibri" w:eastAsia="Calibri" w:hAnsi="Calibri" w:cs="Calibri"/>
+          <w:i/>
+          <w:iCs/>
+        </w:rPr>
+        <w:t xml:space="preserve">, </w:t>
+      </w:r>
+      <w:proofErr w:type="spellStart"/>
+      <w:r>
+        <w:rPr>
+          <w:rFonts w:ascii="Calibri" w:eastAsia="Calibri" w:hAnsi="Calibri" w:cs="Calibri"/>
+          <w:i/>
+          <w:iCs/>
+        </w:rPr>
+        <w:t>FastAPI</w:t>
+      </w:r>
+      <w:proofErr w:type="spellEnd"/>
+      <w:r>
+        <w:rPr>
+          <w:rFonts w:ascii="Calibri" w:eastAsia="Calibri" w:hAnsi="Calibri" w:cs="Calibri"/>
+          <w:i/>
+          <w:iCs/>
+        </w:rPr>
+        <w:t xml:space="preserve">, </w:t>
+      </w:r>
+      <w:proofErr w:type="spellStart"/>
+      <w:r>
+        <w:rPr>
+          <w:rFonts w:ascii="Calibri" w:eastAsia="Calibri" w:hAnsi="Calibri" w:cs="Calibri"/>
+          <w:i/>
+          <w:iCs/>
+        </w:rPr>
+        <w:t>Streamlit</w:t>
+      </w:r>
+      <w:proofErr w:type="spellEnd"/>
+      <w:r>
+        <w:rPr>
+          <w:rFonts w:ascii="Calibri" w:eastAsia="Calibri" w:hAnsi="Calibri" w:cs="Calibri"/>
+          <w:i/>
+          <w:iCs/>
+        </w:rPr>
+        <w:t xml:space="preserve">, </w:t>
+      </w:r>
+      <w:proofErr w:type="spellStart"/>
       <w:proofErr w:type="gramStart"/>
       <w:r>
         <w:rPr>
@@ -523,8 +695,9 @@
           <w:i/>
           <w:iCs/>
         </w:rPr>
-        <w:t>Pydantic</w:t>
-      </w:r>
+        <w:t>PyMuPDF</w:t>
+      </w:r>
+      <w:proofErr w:type="spellEnd"/>
       <w:r>
         <w:rPr>
           <w:rFonts w:ascii="Calibri" w:eastAsia="Calibri" w:hAnsi="Calibri" w:cs="Calibri"/>
@@ -557,6 +730,144 @@
         <w:rPr>
           <w:rFonts w:ascii="Calibri" w:eastAsia="Calibri" w:hAnsi="Calibri" w:cs="Calibri"/>
         </w:rPr>
+        <w:t>– Designing an agentic RAG workflow that parses AI/ML papers into method breakdowns, implementation roadmaps, starter code structure, experiment configs, and reproducibility reports.</w:t>
+      </w:r>
+    </w:p>
+    <w:p>
+      <w:pPr>
+        <w:spacing w:before="120" w:after="20"/>
+      </w:pPr>
+      <w:r>
+        <w:rPr>
+          <w:rFonts w:ascii="Calibri" w:eastAsia="Calibri" w:hAnsi="Calibri" w:cs="Calibri"/>
+          <w:b/>
+          <w:bCs/>
+        </w:rPr>
+        <w:t xml:space="preserve">AI-RFP-Proposal-Generative-Agent </w:t>
+      </w:r>
+      <w:r>
+        <w:rPr>
+          <w:rFonts w:ascii="Calibri" w:eastAsia="Calibri" w:hAnsi="Calibri" w:cs="Calibri"/>
+          <w:i/>
+          <w:iCs/>
+        </w:rPr>
+        <w:t xml:space="preserve">| Python, </w:t>
+      </w:r>
+      <w:proofErr w:type="spellStart"/>
+      <w:r>
+        <w:rPr>
+          <w:rFonts w:ascii="Calibri" w:eastAsia="Calibri" w:hAnsi="Calibri" w:cs="Calibri"/>
+          <w:i/>
+          <w:iCs/>
+        </w:rPr>
+        <w:t>LangGraph</w:t>
+      </w:r>
+      <w:proofErr w:type="spellEnd"/>
+      <w:r>
+        <w:rPr>
+          <w:rFonts w:ascii="Calibri" w:eastAsia="Calibri" w:hAnsi="Calibri" w:cs="Calibri"/>
+          <w:i/>
+          <w:iCs/>
+        </w:rPr>
+        <w:t xml:space="preserve">, </w:t>
+      </w:r>
+      <w:proofErr w:type="spellStart"/>
+      <w:r>
+        <w:rPr>
+          <w:rFonts w:ascii="Calibri" w:eastAsia="Calibri" w:hAnsi="Calibri" w:cs="Calibri"/>
+          <w:i/>
+          <w:iCs/>
+        </w:rPr>
+        <w:t>FastAPI</w:t>
+      </w:r>
+      <w:proofErr w:type="spellEnd"/>
+      <w:r>
+        <w:rPr>
+          <w:rFonts w:ascii="Calibri" w:eastAsia="Calibri" w:hAnsi="Calibri" w:cs="Calibri"/>
+          <w:i/>
+          <w:iCs/>
+        </w:rPr>
+        <w:t xml:space="preserve">, </w:t>
+      </w:r>
+      <w:proofErr w:type="spellStart"/>
+      <w:r>
+        <w:rPr>
+          <w:rFonts w:ascii="Calibri" w:eastAsia="Calibri" w:hAnsi="Calibri" w:cs="Calibri"/>
+          <w:i/>
+          <w:iCs/>
+        </w:rPr>
+        <w:t>Streamlit</w:t>
+      </w:r>
+      <w:proofErr w:type="spellEnd"/>
+      <w:r>
+        <w:rPr>
+          <w:rFonts w:ascii="Calibri" w:eastAsia="Calibri" w:hAnsi="Calibri" w:cs="Calibri"/>
+          <w:i/>
+          <w:iCs/>
+        </w:rPr>
+        <w:t xml:space="preserve">, </w:t>
+      </w:r>
+      <w:proofErr w:type="spellStart"/>
+      <w:r>
+        <w:rPr>
+          <w:rFonts w:ascii="Calibri" w:eastAsia="Calibri" w:hAnsi="Calibri" w:cs="Calibri"/>
+          <w:i/>
+          <w:iCs/>
+        </w:rPr>
+        <w:t>pgvector</w:t>
+      </w:r>
+      <w:proofErr w:type="spellEnd"/>
+      <w:r>
+        <w:rPr>
+          <w:rFonts w:ascii="Calibri" w:eastAsia="Calibri" w:hAnsi="Calibri" w:cs="Calibri"/>
+          <w:i/>
+          <w:iCs/>
+        </w:rPr>
+        <w:t xml:space="preserve">, </w:t>
+      </w:r>
+      <w:proofErr w:type="spellStart"/>
+      <w:proofErr w:type="gramStart"/>
+      <w:r>
+        <w:rPr>
+          <w:rFonts w:ascii="Calibri" w:eastAsia="Calibri" w:hAnsi="Calibri" w:cs="Calibri"/>
+          <w:i/>
+          <w:iCs/>
+        </w:rPr>
+        <w:t>Pydantic</w:t>
+      </w:r>
+      <w:proofErr w:type="spellEnd"/>
+      <w:r>
+        <w:rPr>
+          <w:rFonts w:ascii="Calibri" w:eastAsia="Calibri" w:hAnsi="Calibri" w:cs="Calibri"/>
+        </w:rPr>
+        <w:t xml:space="preserve">  |</w:t>
+      </w:r>
+      <w:proofErr w:type="gramEnd"/>
+      <w:r>
+        <w:rPr>
+          <w:rFonts w:ascii="Calibri" w:eastAsia="Calibri" w:hAnsi="Calibri" w:cs="Calibri"/>
+        </w:rPr>
+        <w:t xml:space="preserve">  </w:t>
+      </w:r>
+      <w:hyperlink r:id="rId11" w:history="1">
+        <w:r>
+          <w:rPr>
+            <w:rStyle w:val="Hyperlink"/>
+            <w:rFonts w:ascii="Calibri" w:eastAsia="Calibri" w:hAnsi="Calibri" w:cs="Calibri"/>
+          </w:rPr>
+          <w:t>GitHub</w:t>
+        </w:r>
+      </w:hyperlink>
+    </w:p>
+    <w:p>
+      <w:pPr>
+        <w:spacing w:after="40"/>
+        <w:ind w:left="270" w:hanging="200"/>
+      </w:pPr>
+      <w:r>
+        <w:rPr>
+          <w:rFonts w:ascii="Calibri" w:eastAsia="Calibri" w:hAnsi="Calibri" w:cs="Calibri"/>
+        </w:rPr>
         <w:t>– Designing an RFP/tender analysis agent to extract requirements, retrieve company evidence, score compliance, identify risks/gaps, and generate clarification questions and proposal drafts.</w:t>
       </w:r>
     </w:p>
@@ -670,12 +981,70 @@
         </w:rPr>
         <w:t xml:space="preserve">Backend &amp; APIs: </w:t>
       </w:r>
-      <w:r>
-        <w:rPr>
-          <w:rFonts w:ascii="Calibri" w:eastAsia="Calibri" w:hAnsi="Calibri" w:cs="Calibri"/>
-        </w:rPr>
-        <w:t>FastAPI, Fastify, REST APIs, WebSockets, Pydantic, Zod, Streamlit</w:t>
-      </w:r>
+      <w:proofErr w:type="spellStart"/>
+      <w:r>
+        <w:rPr>
+          <w:rFonts w:ascii="Calibri" w:eastAsia="Calibri" w:hAnsi="Calibri" w:cs="Calibri"/>
+        </w:rPr>
+        <w:t>FastAPI</w:t>
+      </w:r>
+      <w:proofErr w:type="spellEnd"/>
+      <w:r>
+        <w:rPr>
+          <w:rFonts w:ascii="Calibri" w:eastAsia="Calibri" w:hAnsi="Calibri" w:cs="Calibri"/>
+        </w:rPr>
+        <w:t xml:space="preserve">, </w:t>
+      </w:r>
+      <w:proofErr w:type="spellStart"/>
+      <w:r>
+        <w:rPr>
+          <w:rFonts w:ascii="Calibri" w:eastAsia="Calibri" w:hAnsi="Calibri" w:cs="Calibri"/>
+        </w:rPr>
+        <w:t>Fastify</w:t>
+      </w:r>
+      <w:proofErr w:type="spellEnd"/>
+      <w:r>
+        <w:rPr>
+          <w:rFonts w:ascii="Calibri" w:eastAsia="Calibri" w:hAnsi="Calibri" w:cs="Calibri"/>
+        </w:rPr>
+        <w:t xml:space="preserve">, REST APIs, </w:t>
+      </w:r>
+      <w:proofErr w:type="spellStart"/>
+      <w:r>
+        <w:rPr>
+          <w:rFonts w:ascii="Calibri" w:eastAsia="Calibri" w:hAnsi="Calibri" w:cs="Calibri"/>
+        </w:rPr>
+        <w:t>WebSockets</w:t>
+      </w:r>
+      <w:proofErr w:type="spellEnd"/>
+      <w:r>
+        <w:rPr>
+          <w:rFonts w:ascii="Calibri" w:eastAsia="Calibri" w:hAnsi="Calibri" w:cs="Calibri"/>
+        </w:rPr>
+        <w:t xml:space="preserve">, </w:t>
+      </w:r>
+      <w:proofErr w:type="spellStart"/>
+      <w:r>
+        <w:rPr>
+          <w:rFonts w:ascii="Calibri" w:eastAsia="Calibri" w:hAnsi="Calibri" w:cs="Calibri"/>
+        </w:rPr>
+        <w:t>Pydantic</w:t>
+      </w:r>
+      <w:proofErr w:type="spellEnd"/>
+      <w:r>
+        <w:rPr>
+          <w:rFonts w:ascii="Calibri" w:eastAsia="Calibri" w:hAnsi="Calibri" w:cs="Calibri"/>
+        </w:rPr>
+        <w:t xml:space="preserve">, Zod, </w:t>
+      </w:r>
+      <w:proofErr w:type="spellStart"/>
+      <w:r>
+        <w:rPr>
+          <w:rFonts w:ascii="Calibri" w:eastAsia="Calibri" w:hAnsi="Calibri" w:cs="Calibri"/>
+        </w:rPr>
+        <w:t>Streamlit</w:t>
+      </w:r>
+      <w:proofErr w:type="spellEnd"/>
     </w:p>
     <w:p>
       <w:pPr>
@@ -693,7 +1062,35 @@
         <w:rPr>
           <w:rFonts w:ascii="Calibri" w:eastAsia="Calibri" w:hAnsi="Calibri" w:cs="Calibri"/>
         </w:rPr>
-        <w:t>PostgreSQL, PostGIS, pgvector, MySQL, time-series data, SQL migrations</w:t>
+        <w:t xml:space="preserve">PostgreSQL, </w:t>
+      </w:r>
+      <w:proofErr w:type="spellStart"/>
+      <w:r>
+        <w:rPr>
+          <w:rFonts w:ascii="Calibri" w:eastAsia="Calibri" w:hAnsi="Calibri" w:cs="Calibri"/>
+        </w:rPr>
+        <w:t>PostGIS</w:t>
+      </w:r>
+      <w:proofErr w:type="spellEnd"/>
+      <w:r>
+        <w:rPr>
+          <w:rFonts w:ascii="Calibri" w:eastAsia="Calibri" w:hAnsi="Calibri" w:cs="Calibri"/>
+        </w:rPr>
+        <w:t xml:space="preserve">, </w:t>
+      </w:r>
+      <w:proofErr w:type="spellStart"/>
+      <w:r>
+        <w:rPr>
+          <w:rFonts w:ascii="Calibri" w:eastAsia="Calibri" w:hAnsi="Calibri" w:cs="Calibri"/>
+        </w:rPr>
+        <w:t>pgvector</w:t>
+      </w:r>
+      <w:proofErr w:type="spellEnd"/>
+      <w:r>
+        <w:rPr>
+          <w:rFonts w:ascii="Calibri" w:eastAsia="Calibri" w:hAnsi="Calibri" w:cs="Calibri"/>
+        </w:rPr>
+        <w:t>, MySQL, time-series data, SQL migrations</w:t>
       </w:r>
     </w:p>
     <w:p>
@@ -708,11 +1105,33 @@
         </w:rPr>
         <w:t xml:space="preserve">AI / Agents / RAG: </w:t>
       </w:r>
-      <w:r>
-        <w:rPr>
-          <w:rFonts w:ascii="Calibri" w:eastAsia="Calibri" w:hAnsi="Calibri" w:cs="Calibri"/>
-        </w:rPr>
-        <w:t>LangGraph, LangChain, LLM APIs, embeddings, vector search, prompt workflows, structured extraction</w:t>
+      <w:proofErr w:type="spellStart"/>
+      <w:r>
+        <w:rPr>
+          <w:rFonts w:ascii="Calibri" w:eastAsia="Calibri" w:hAnsi="Calibri" w:cs="Calibri"/>
+        </w:rPr>
+        <w:t>LangGraph</w:t>
+      </w:r>
+      <w:proofErr w:type="spellEnd"/>
+      <w:r>
+        <w:rPr>
+          <w:rFonts w:ascii="Calibri" w:eastAsia="Calibri" w:hAnsi="Calibri" w:cs="Calibri"/>
+        </w:rPr>
+        <w:t xml:space="preserve">, </w:t>
+      </w:r>
+      <w:proofErr w:type="spellStart"/>
+      <w:r>
+        <w:rPr>
+          <w:rFonts w:ascii="Calibri" w:eastAsia="Calibri" w:hAnsi="Calibri" w:cs="Calibri"/>
+        </w:rPr>
+        <w:t>LangChain</w:t>
+      </w:r>
+      <w:proofErr w:type="spellEnd"/>
+      <w:r>
+        <w:rPr>
+          <w:rFonts w:ascii="Calibri" w:eastAsia="Calibri" w:hAnsi="Calibri" w:cs="Calibri"/>
+        </w:rPr>
+        <w:t>, LLM APIs, embeddings, vector search, prompt workflows, structured extraction</w:t>
       </w:r>
     </w:p>
     <w:p>
@@ -731,7 +1150,21 @@
         <w:rPr>
           <w:rFonts w:ascii="Calibri" w:eastAsia="Calibri" w:hAnsi="Calibri" w:cs="Calibri"/>
         </w:rPr>
-        <w:t>Git, GitHub, GitHub Actions, Docker basics, pnpm, CLI workflows, Excel, Power BI</w:t>
+        <w:t xml:space="preserve">Git, GitHub, GitHub Actions, Docker basics, </w:t>
+      </w:r>
+      <w:proofErr w:type="spellStart"/>
+      <w:r>
+        <w:rPr>
+          <w:rFonts w:ascii="Calibri" w:eastAsia="Calibri" w:hAnsi="Calibri" w:cs="Calibri"/>
+        </w:rPr>
+        <w:t>pnpm</w:t>
+      </w:r>
+      <w:proofErr w:type="spellEnd"/>
+      <w:r>
+        <w:rPr>
+          <w:rFonts w:ascii="Calibri" w:eastAsia="Calibri" w:hAnsi="Calibri" w:cs="Calibri"/>
+        </w:rPr>
+        <w:t>, CLI workflows, Excel, Power BI</w:t>
       </w:r>
     </w:p>
     <w:sectPr>
@@ -1429,6 +1862,30 @@
       <w:szCs w:val="20"/>
     </w:rPr>
   </w:style>
+  <w:style w:type="character" w:styleId="UnresolvedMention">
+    <w:name w:val="Unresolved Mention"/>
+    <w:basedOn w:val="DefaultParagraphFont"/>
+    <w:uiPriority w:val="99"/>
+    <w:semiHidden/>
+    <w:unhideWhenUsed/>
+    <w:rsid w:val="006065C6"/>
+    <w:rPr>
+      <w:color w:val="605E5C"/>
+      <w:shd w:val="clear" w:color="auto" w:fill="E1DFDD"/>
+    </w:rPr>
+  </w:style>
+  <w:style w:type="character" w:styleId="FollowedHyperlink">
+    <w:name w:val="FollowedHyperlink"/>
+    <w:basedOn w:val="DefaultParagraphFont"/>
+    <w:uiPriority w:val="99"/>
+    <w:semiHidden/>
+    <w:unhideWhenUsed/>
+    <w:rsid w:val="006065C6"/>
+    <w:rPr>
+      <w:color w:val="954F72" w:themeColor="followedHyperlink"/>
+      <w:u w:val="single"/>
+    </w:rPr>
+  </w:style>
 </w:styles>
 </file>
 

</xml_diff>